<commit_message>
Round-2 merge: survivorship disclosure, wave contrast tests, SE layout, blue-marking diff, Seat 1/2 fixes; build_r3 and deliverables_round2
Co-Authored-By: Claude Opus 5.5 <noreply@anthropic.com>
Claude-Session: https://claude.ai/code/session_01Ny4MKFPCnQG8RbtvfHQ86Z
</commit_message>
<xml_diff>
--- a/SAJE_292892_revision/project_R/docx_build/saje_reference.docx
+++ b/SAJE_292892_revision/project_R/docx_build/saje_reference.docx
@@ -616,7 +616,7 @@
       <w:jc w:val="center"/>
     </w:pPr>
     <w:rPr>
-      <w:rFonts w:asciiTheme="majorHAnsi" w:eastAsiaTheme="majorEastAsia" w:hAnsiTheme="majorHAnsi" w:cstheme="majorBidi" w:ascii="Times New Roman" w:hAnsi="Times New Roman" w:eastAsia="Times New Roman"/>
+      <w:rFonts w:ascii="Times New Roman" w:hAnsi="Times New Roman" w:eastAsia="Times New Roman"/>
       <w:b/>
       <w:bCs/>
       <w:color w:val="000000"/>
@@ -726,7 +726,7 @@
       <w:outlineLvl w:val="0"/>
     </w:pPr>
     <w:rPr>
-      <w:rFonts w:asciiTheme="majorHAnsi" w:eastAsiaTheme="majorEastAsia" w:hAnsiTheme="majorHAnsi" w:cstheme="majorBidi" w:ascii="Times New Roman" w:hAnsi="Times New Roman" w:eastAsia="Times New Roman"/>
+      <w:rFonts w:ascii="Times New Roman" w:hAnsi="Times New Roman" w:eastAsia="Times New Roman"/>
       <w:b/>
       <w:bCs/>
       <w:color w:val="000000"/>
@@ -748,7 +748,7 @@
       <w:outlineLvl w:val="1"/>
     </w:pPr>
     <w:rPr>
-      <w:rFonts w:asciiTheme="majorHAnsi" w:eastAsiaTheme="majorEastAsia" w:hAnsiTheme="majorHAnsi" w:cstheme="majorBidi" w:ascii="Times New Roman" w:hAnsi="Times New Roman" w:eastAsia="Times New Roman"/>
+      <w:rFonts w:ascii="Times New Roman" w:hAnsi="Times New Roman" w:eastAsia="Times New Roman"/>
       <w:b/>
       <w:bCs/>
       <w:color w:val="000000"/>
@@ -770,7 +770,7 @@
       <w:outlineLvl w:val="2"/>
     </w:pPr>
     <w:rPr>
-      <w:rFonts w:asciiTheme="majorHAnsi" w:eastAsiaTheme="majorEastAsia" w:hAnsiTheme="majorHAnsi" w:cstheme="majorBidi" w:ascii="Times New Roman" w:hAnsi="Times New Roman" w:eastAsia="Times New Roman"/>
+      <w:rFonts w:ascii="Times New Roman" w:hAnsi="Times New Roman" w:eastAsia="Times New Roman"/>
       <w:b/>
       <w:bCs/>
       <w:color w:val="000000"/>
@@ -792,7 +792,7 @@
       <w:outlineLvl w:val="3"/>
     </w:pPr>
     <w:rPr>
-      <w:rFonts w:asciiTheme="majorHAnsi" w:eastAsiaTheme="majorEastAsia" w:hAnsiTheme="majorHAnsi" w:cstheme="majorBidi" w:ascii="Times New Roman" w:hAnsi="Times New Roman" w:eastAsia="Times New Roman"/>
+      <w:rFonts w:ascii="Times New Roman" w:hAnsi="Times New Roman" w:eastAsia="Times New Roman"/>
       <w:i/>
       <w:bCs/>
       <w:color w:val="000000"/>
@@ -814,7 +814,7 @@
       <w:outlineLvl w:val="4"/>
     </w:pPr>
     <w:rPr>
-      <w:rFonts w:asciiTheme="majorHAnsi" w:eastAsiaTheme="majorEastAsia" w:hAnsiTheme="majorHAnsi" w:cstheme="majorBidi" w:ascii="Times New Roman" w:hAnsi="Times New Roman" w:eastAsia="Times New Roman"/>
+      <w:rFonts w:ascii="Times New Roman" w:hAnsi="Times New Roman" w:eastAsia="Times New Roman"/>
       <w:iCs/>
       <w:color w:val="000000"/>
       <w:sz w:val="24"/>
@@ -835,7 +835,7 @@
       <w:outlineLvl w:val="5"/>
     </w:pPr>
     <w:rPr>
-      <w:rFonts w:asciiTheme="majorHAnsi" w:eastAsiaTheme="majorEastAsia" w:hAnsiTheme="majorHAnsi" w:cstheme="majorBidi" w:ascii="Times New Roman" w:hAnsi="Times New Roman" w:eastAsia="Times New Roman"/>
+      <w:rFonts w:ascii="Times New Roman" w:hAnsi="Times New Roman" w:eastAsia="Times New Roman"/>
       <w:color w:val="000000"/>
       <w:sz w:val="24"/>
       <w:szCs w:val="24"/>
@@ -855,7 +855,7 @@
       <w:outlineLvl w:val="6"/>
     </w:pPr>
     <w:rPr>
-      <w:rFonts w:asciiTheme="majorHAnsi" w:eastAsiaTheme="majorEastAsia" w:hAnsiTheme="majorHAnsi" w:cstheme="majorBidi" w:ascii="Times New Roman" w:hAnsi="Times New Roman" w:eastAsia="Times New Roman"/>
+      <w:rFonts w:ascii="Times New Roman" w:hAnsi="Times New Roman" w:eastAsia="Times New Roman"/>
       <w:color w:val="000000"/>
       <w:sz w:val="24"/>
       <w:szCs w:val="24"/>
@@ -875,7 +875,7 @@
       <w:outlineLvl w:val="7"/>
     </w:pPr>
     <w:rPr>
-      <w:rFonts w:asciiTheme="majorHAnsi" w:eastAsiaTheme="majorEastAsia" w:hAnsiTheme="majorHAnsi" w:cstheme="majorBidi" w:ascii="Times New Roman" w:hAnsi="Times New Roman" w:eastAsia="Times New Roman"/>
+      <w:rFonts w:ascii="Times New Roman" w:hAnsi="Times New Roman" w:eastAsia="Times New Roman"/>
       <w:color w:val="000000"/>
       <w:sz w:val="24"/>
       <w:szCs w:val="24"/>
@@ -895,7 +895,7 @@
       <w:outlineLvl w:val="8"/>
     </w:pPr>
     <w:rPr>
-      <w:rFonts w:asciiTheme="majorHAnsi" w:eastAsiaTheme="majorEastAsia" w:hAnsiTheme="majorHAnsi" w:cstheme="majorBidi" w:ascii="Times New Roman" w:hAnsi="Times New Roman" w:eastAsia="Times New Roman"/>
+      <w:rFonts w:ascii="Times New Roman" w:hAnsi="Times New Roman" w:eastAsia="Times New Roman"/>
       <w:color w:val="000000"/>
       <w:sz w:val="24"/>
       <w:szCs w:val="24"/>
@@ -1087,7 +1087,7 @@
       <w:outlineLvl w:val="9"/>
     </w:pPr>
     <w:rPr>
-      <w:rFonts w:asciiTheme="majorHAnsi" w:eastAsiaTheme="majorEastAsia" w:hAnsiTheme="majorHAnsi" w:cstheme="majorBidi" w:ascii="Times New Roman" w:hAnsi="Times New Roman" w:eastAsia="Times New Roman"/>
+      <w:rFonts w:ascii="Times New Roman" w:hAnsi="Times New Roman" w:eastAsia="Times New Roman"/>
       <w:b w:val="0"/>
       <w:bCs w:val="0"/>
       <w:color w:val="365F91" w:themeColor="accent1" w:themeShade="BF"/>

</xml_diff>